<commit_message>
Add sources and attribution section to the research brief
Names both Kaggle datasets and their licences, the regulator sources behind
them, the South African published sources, and the tools used. The Italian
data's licence requires attribution and the European Medicines Agency asks
for acknowledgement, so these belong in the brief itself and not only in the
repository notes.
</commit_message>
<xml_diff>
--- a/Research_Brief_K.M.docx
+++ b/Research_Brief_K.M.docx
@@ -2,7 +2,7 @@
 <file path=word/document.xml><?xml version="1.0" encoding="utf-8"?>
 <w:document xmlns:w="http://schemas.openxmlformats.org/wordprocessingml/2006/main" xmlns:m="http://schemas.openxmlformats.org/officeDocument/2006/math" xmlns:r="http://schemas.openxmlformats.org/officeDocument/2006/relationships" xmlns:o="urn:schemas-microsoft-com:office:office" xmlns:v="urn:schemas-microsoft-com:vml" xmlns:w10="urn:schemas-microsoft-com:office:word" xmlns:a="http://schemas.openxmlformats.org/drawingml/2006/main" xmlns:pic="http://schemas.openxmlformats.org/drawingml/2006/picture" xmlns:wp="http://schemas.openxmlformats.org/drawingml/2006/wordprocessingDrawing">
   <w:body>
-    <w:bookmarkStart w:id="23" w:name="research-brief"/>
+    <w:bookmarkStart w:id="24" w:name="research-brief"/>
     <w:p>
       <w:pPr>
         <w:pStyle w:val="Heading1"/>
@@ -1378,8 +1378,111 @@
         <w:t xml:space="preserve">Of twelve injectable cancer medicines examined across four medicines regulators, only ifosfamide is recorded as an active shortage by all four at once, and the three regulators outside the United States recorded it between four and six months before the United States did. South Africa, however, has confirmed disruptions in only two of the twelve, carboplatin and docetaxel, named in a parliamentary reply of 26 June 2026, and ifosfamide is not among them, so the overseas record did not anticipate the local problem. Underneath the shortages sits a slower structural change: 29 of the 88 package listings are manufacturers withdrawing rather than running short, affecting nine of the twelve medicines, and one company alone holds 16 of those 88 listings. The most consequential finding for the business is that South Africa publishes no shortage register and ran no national stock audit in the year to June 2026, while importing about 65 per cent of its medicines, so early warning must be built in-house rather than read from a public source. Because the Single Exit Price forbids buying below the published price, deeper stock cover earns nothing on the purchase and must be justified by the cost of a missed treatment date instead. Overall confidence is Medium: it is High that ifosfamide is recorded by all four regulators and that South Africa has neither a shortage register nor any price advantage from holding stock, and Medium for the supplier-concentration finding, the methotrexate deterioration and the carboplatin comparison, because each rests on a single register, on two snapshot dates, or on one parliamentary reply. The recommendation is therefore narrow and defensible: hold deeper cover on carboplatin and docetaxel, watch ifosfamide and methotrexate, and treat the foreign registers as a hypothesis to be tested against wholesaler data rather than as an early-warning system that has been shown to work.</w:t>
       </w:r>
     </w:p>
+    <w:p>
+      <w:r>
+        <w:pict>
+          <v:rect style="width:0;height:1.5pt" o:hralign="center" o:hrstd="t" o:hr="t"/>
+        </w:pict>
+      </w:r>
+    </w:p>
     <w:bookmarkEnd w:id="22"/>
+    <w:bookmarkStart w:id="23" w:name="sources-and-attribution"/>
+    <w:p>
+      <w:pPr>
+        <w:pStyle w:val="Heading2"/>
+      </w:pPr>
+      <w:r>
+        <w:t xml:space="preserve">Sources and Attribution</w:t>
+      </w:r>
+    </w:p>
+    <w:p>
+      <w:pPr>
+        <w:pStyle w:val="FirstParagraph"/>
+      </w:pPr>
+      <w:r>
+        <w:t xml:space="preserve">All data used in this brief is published and openly licensed. Nothing confidential or internal to any company was used.</w:t>
+      </w:r>
+    </w:p>
+    <w:p>
+      <w:pPr>
+        <w:pStyle w:val="BodyText"/>
+      </w:pPr>
+      <w:r>
+        <w:rPr>
+          <w:b/>
+          <w:bCs/>
+        </w:rPr>
+        <w:t xml:space="preserve">Supply data, first source.</w:t>
+      </w:r>
+      <w:r>
+        <w:t xml:space="preserve"> </w:t>
+      </w:r>
+      <w:r>
+        <w:t xml:space="preserve">“FDA Drug Shortages and Discontinuations”</w:t>
+      </w:r>
+      <w:r>
+        <w:t xml:space="preserve">, published on Kaggle, which is a public website that hosts shared datasets, by the user kylefengkfeng209 and credited to Mind Lab. It is licensed under Creative Commons Attribution-NonCommercial-ShareAlike 4.0. The underlying information is the openFDA public feed of the United States Food and Drug Administration. The copy used is the snapshot of 7 August 2026.</w:t>
+      </w:r>
+    </w:p>
+    <w:p>
+      <w:pPr>
+        <w:pStyle w:val="BodyText"/>
+      </w:pPr>
+      <w:r>
+        <w:rPr>
+          <w:b/>
+          <w:bCs/>
+        </w:rPr>
+        <w:t xml:space="preserve">Supply data, second source.</w:t>
+      </w:r>
+      <w:r>
+        <w:t xml:space="preserve"> </w:t>
+      </w:r>
+      <w:r>
+        <w:t xml:space="preserve">“Airmid Eireann: Ireland’s Open Pharma Data”</w:t>
+      </w:r>
+      <w:r>
+        <w:t xml:space="preserve">, published on Kaggle by the user sreepriyaprasannan. Four tables from it were used, covering the Italian Medicines Agency, the European Medicines Agency, the French National Agency for Medicines and Health Products Safety, and a later snapshot of the United States register dated 15 October 2026. The Italian data is licensed under Creative Commons Attribution 4.0 and is attributed to the Italian Medicines Agency. The European Medicines Agency data is reproduced with acknowledgement to that agency. The French data is reused without alteration, as its terms require.</w:t>
+      </w:r>
+    </w:p>
+    <w:p>
+      <w:pPr>
+        <w:pStyle w:val="BodyText"/>
+      </w:pPr>
+      <w:r>
+        <w:rPr>
+          <w:b/>
+          <w:bCs/>
+        </w:rPr>
+        <w:t xml:space="preserve">South African context.</w:t>
+      </w:r>
+      <w:r>
+        <w:t xml:space="preserve"> </w:t>
+      </w:r>
+      <w:r>
+        <w:t xml:space="preserve">The reply to parliamentary question NW2997, dated 26 June 2026, published by the Parliamentary Monitoring Group. Government notices setting the Single Exit Price and the dispensing fee. The South African Pharmacy Council’s practice rules for oncology services. Published material from the South African Health Products Regulatory Authority, the National Department of Health, Discovery Health and the Government Employees Medical Scheme. A study published in BMJ Global Health on medicines for childhood cancers in South Africa. Figures describing the scale of competitor pharmacy networks come from commercial company-profile websites, and are identified in section 7 as the weakest sources used here.</w:t>
+      </w:r>
+    </w:p>
+    <w:p>
+      <w:pPr>
+        <w:pStyle w:val="BodyText"/>
+      </w:pPr>
+      <w:r>
+        <w:rPr>
+          <w:b/>
+          <w:bCs/>
+        </w:rPr>
+        <w:t xml:space="preserve">Tools.</w:t>
+      </w:r>
+      <w:r>
+        <w:t xml:space="preserve"> </w:t>
+      </w:r>
+      <w:r>
+        <w:t xml:space="preserve">The analysis was carried out in Amazon Quick Suite, using a Space, a chat agent and Quick Research, as described in section 3. Every figure produced by those tools was recalculated from the original data files before it was used in this brief, and the places where a tool’s output was wrong are recorded in section 7.</w:t>
+      </w:r>
+    </w:p>
     <w:bookmarkEnd w:id="23"/>
+    <w:bookmarkEnd w:id="24"/>
     <w:sectPr>
       <w:footnotePr>
         <w:numRestart w:val="eachSect"/>

</xml_diff>